<commit_message>
Add Backfill-AgentRegistry.ps1 for full tenant .agent file inventory via Graph Search
</commit_message>
<xml_diff>
--- a/Full_Implementation_Guide_No_Bicep.docx
+++ b/Full_Implementation_Guide_No_Bicep.docx
@@ -3938,6 +3938,30 @@
     <w:bookmarkEnd w:id="30"/>
     <w:bookmarkEnd w:id="31"/>
     <w:bookmarkStart w:id="32" w:name="X7fe1f6ec2ff0af7e08ca4a019d7ae8cf76a66bb"/>
+    <w:p>
+      <w:r>
+        <w:rPr>
+          <w:b/>
+        </w:rPr>
+        <w:t xml:space="preserve">Complete baseline scan (recommended for existing tenants): </w:t>
+      </w:r>
+      <w:r>
+        <w:t xml:space="preserve">The audit-log approach above is limited by Unified Audit Log retention (typically 90-180 days) and only captures events from when the Audit.SharePoint subscription was active. To inventory every .agent file currently in SharePoint, regardless of when it was created, run the standalone baseline script instead.</w:t>
+      </w:r>
+    </w:p>
+    <w:p>
+      <w:r>
+        <w:rPr>
+          <w:rFonts w:ascii="Consolas" w:hAnsi="Consolas"/>
+        </w:rPr>
+        <w:t xml:space="preserve">.\scripts\Backfill-AgentRegistry.ps1 -TenantId "&lt;your-tenant-id&gt;" -SharePointSiteUrl "https://contoso.sharepoint.com/sites/CopilotReporting"</w:t>
+      </w:r>
+    </w:p>
+    <w:p>
+      <w:r>
+        <w:t xml:space="preserve">This uses the Microsoft Search API to find .agent files tenant-wide and inserts any not already in the registry, deduplicated by file URL and safe to re-run. Requires the SharePointCopilotAgentRegistry list to already exist (Step 7). Run this once as your initial baseline; PullSharePointAgents handles all agent creations going forward.</w:t>
+      </w:r>
+    </w:p>
     <w:p>
       <w:pPr>
         <w:pStyle w:val="Heading1"/>

</xml_diff>

<commit_message>
Migrate to Flex Consumption; add Copilot Studio agent tracker; update docs
- infra: make Flex Consumption (FC1) canonical in main.bicep/main.bicepparam/azuredeploy.json; remove separate main.flex.* twin

- function-app: add PullCopilotStudioAgents (audit-only Copilot Studio agent registry); host.json disables App Insights adaptive sampling for full function-log visibility

- scripts: add Invoke-LabFunction.ps1 (trigger + follow-logs helper)

- docs: README + Word docs EP1 -> Flex Consumption; add storage volume & cost estimate section to IL5 assessment
</commit_message>
<xml_diff>
--- a/Full_Implementation_Guide_No_Bicep.docx
+++ b/Full_Implementation_Guide_No_Bicep.docx
@@ -7,7 +7,7 @@
         <w:pStyle w:val="Title"/>
       </w:pPr>
       <w:r>
-        <w:t xml:space="preserve">Copilot Adoption Dashboard — Full Implementation Guide</w:t>
+        <w:t xml:space="preserve">Copilot Adoption Dashboard â€” Full Implementation Guide</w:t>
       </w:r>
     </w:p>
     <w:p>
@@ -151,10 +151,7 @@
               <w:t xml:space="preserve">deployLogAnalytics</w:t>
             </w:r>
             <w:r>
-              <w:t xml:space="preserve"> </w:t>
-            </w:r>
-            <w:r>
-              <w:t xml:space="preserve">parameter</w:t>
+              <w:t xml:space="preserve"> parameter</w:t>
             </w:r>
           </w:p>
         </w:tc>
@@ -491,10 +488,7 @@
         <w:pStyle w:val="BodyText"/>
       </w:pPr>
       <w:r>
-        <w:t xml:space="preserve">Steps marked</w:t>
-      </w:r>
-      <w:r>
-        <w:t xml:space="preserve"> </w:t>
+        <w:t xml:space="preserve">Steps marked </w:t>
       </w:r>
       <w:r>
         <w:rPr>
@@ -504,10 +498,7 @@
         <w:t xml:space="preserve">(Log Analytics only)</w:t>
       </w:r>
       <w:r>
-        <w:t xml:space="preserve"> </w:t>
-      </w:r>
-      <w:r>
-        <w:t xml:space="preserve">apply exclusively to the full deployment.</w:t>
+        <w:t xml:space="preserve"> apply exclusively to the full deployment.</w:t>
       </w:r>
     </w:p>
     <w:bookmarkEnd w:id="9"/>
@@ -549,7 +540,7 @@
         <w:rPr>
           <w:rStyle w:val="VerbatimChar"/>
         </w:rPr>
-        <w:t xml:space="preserve">        │ every 15 min (PullCopilotAudit)</w:t>
+        <w:t xml:space="preserve">        â”‚ every 15 min (PullCopilotAudit)</w:t>
       </w:r>
       <w:r>
         <w:br/>
@@ -558,7 +549,7 @@
         <w:rPr>
           <w:rStyle w:val="VerbatimChar"/>
         </w:rPr>
-        <w:t xml:space="preserve">        ▼</w:t>
+        <w:t xml:space="preserve">        â–¼</w:t>
       </w:r>
       <w:r>
         <w:br/>
@@ -567,7 +558,7 @@
         <w:rPr>
           <w:rStyle w:val="VerbatimChar"/>
         </w:rPr>
-        <w:t xml:space="preserve">Azure Function App (PowerShell 7.4, Premium EP1)</w:t>
+        <w:t xml:space="preserve">Azure Function App (PowerShell 7.4, Flex Consumption FC1)</w:t>
       </w:r>
       <w:r>
         <w:br/>
@@ -576,7 +567,7 @@
         <w:rPr>
           <w:rStyle w:val="VerbatimChar"/>
         </w:rPr>
-        <w:t xml:space="preserve">   ┌────┴───────────────────────────────────────────┐</w:t>
+        <w:t xml:space="preserve">   â”Œâ”€â”€â”€â”€â”´â”€â”€â”€â”€â”€â”€â”€â”€â”€â”€â”€â”€â”€â”€â”€â”€â”€â”€â”€â”€â”€â”€â”€â”€â”€â”€â”€â”€â”€â”€â”€â”€â”€â”€â”€â”€â”€â”€â”€â”€â”€â”€â”€â”</w:t>
       </w:r>
       <w:r>
         <w:br/>
@@ -585,7 +576,7 @@
         <w:rPr>
           <w:rStyle w:val="VerbatimChar"/>
         </w:rPr>
-        <w:t xml:space="preserve">   ▼                                                 ▼</w:t>
+        <w:t xml:space="preserve">   â–¼                                                 â–¼</w:t>
       </w:r>
       <w:r>
         <w:br/>
@@ -603,7 +594,7 @@
         <w:rPr>
           <w:rStyle w:val="VerbatimChar"/>
         </w:rPr>
-        <w:t xml:space="preserve">   │                                                 │</w:t>
+        <w:t xml:space="preserve">   â”‚                                                 â”‚</w:t>
       </w:r>
       <w:r>
         <w:br/>
@@ -612,7 +603,7 @@
         <w:rPr>
           <w:rStyle w:val="VerbatimChar"/>
         </w:rPr>
-        <w:t xml:space="preserve">   ▼                                                 ▼</w:t>
+        <w:t xml:space="preserve">   â–¼                                                 â–¼</w:t>
       </w:r>
       <w:r>
         <w:br/>
@@ -630,7 +621,7 @@
         <w:rPr>
           <w:rStyle w:val="VerbatimChar"/>
         </w:rPr>
-        <w:t xml:space="preserve">   │</w:t>
+        <w:t xml:space="preserve">   â”‚</w:t>
       </w:r>
       <w:r>
         <w:br/>
@@ -639,7 +630,7 @@
         <w:rPr>
           <w:rStyle w:val="VerbatimChar"/>
         </w:rPr>
-        <w:t xml:space="preserve">   ▼</w:t>
+        <w:t xml:space="preserve">   â–¼</w:t>
       </w:r>
       <w:r>
         <w:br/>
@@ -652,8 +643,6 @@
       </w:r>
       <w:r>
         <w:br/>
-      </w:r>
-      <w:r>
         <w:br/>
       </w:r>
       <w:r>
@@ -669,7 +658,7 @@
         <w:rPr>
           <w:rStyle w:val="VerbatimChar"/>
         </w:rPr>
-        <w:t xml:space="preserve">        │ every 15 min (PullSharePointAgents)</w:t>
+        <w:t xml:space="preserve">        â”‚ every 15 min (PullSharePointAgents)</w:t>
       </w:r>
       <w:r>
         <w:br/>
@@ -678,7 +667,7 @@
         <w:rPr>
           <w:rStyle w:val="VerbatimChar"/>
         </w:rPr>
-        <w:t xml:space="preserve">        ▼</w:t>
+        <w:t xml:space="preserve">        â–¼</w:t>
       </w:r>
       <w:r>
         <w:br/>
@@ -717,7 +706,7 @@
         </w:numPr>
       </w:pPr>
       <w:r>
-        <w:t xml:space="preserve">Azure subscription with Contributor role and Elastic Premium VM quota &gt;= 1</w:t>
+        <w:t xml:space="preserve">Azure subscription with Contributor role; the Microsoft.App resource provider registered in the subscription (Flex Consumption)</w:t>
       </w:r>
     </w:p>
     <w:p>
@@ -765,10 +754,7 @@
         </w:numPr>
       </w:pPr>
       <w:r>
-        <w:t xml:space="preserve">PowerShell 5.1+ with Microsoft.Graph module:</w:t>
-      </w:r>
-      <w:r>
-        <w:t xml:space="preserve"> </w:t>
+        <w:t xml:space="preserve">PowerShell 5.1+ with Microsoft.Graph module: </w:t>
       </w:r>
       <w:r>
         <w:rPr>
@@ -786,10 +772,7 @@
         </w:numPr>
       </w:pPr>
       <w:r>
-        <w:t xml:space="preserve">Azure Functions Core Tools v4:</w:t>
-      </w:r>
-      <w:r>
-        <w:t xml:space="preserve"> </w:t>
+        <w:t xml:space="preserve">Azure Functions Core Tools v4: </w:t>
       </w:r>
       <w:r>
         <w:rPr>
@@ -857,7 +840,7 @@
         </w:numPr>
       </w:pPr>
       <w:r>
-        <w:t xml:space="preserve">Portal → Resource groups → + Create</w:t>
+        <w:t xml:space="preserve">Portal â†’ Resource groups â†’ + Create</w:t>
       </w:r>
     </w:p>
     <w:p>
@@ -869,10 +852,7 @@
         </w:numPr>
       </w:pPr>
       <w:r>
-        <w:t xml:space="preserve">Name:</w:t>
-      </w:r>
-      <w:r>
-        <w:t xml:space="preserve"> </w:t>
+        <w:t xml:space="preserve">Name: </w:t>
       </w:r>
       <w:r>
         <w:rPr>
@@ -903,7 +883,7 @@
         </w:numPr>
       </w:pPr>
       <w:r>
-        <w:t xml:space="preserve">Portal → Deploy a custom template → Build your own template in the editor</w:t>
+        <w:t xml:space="preserve">Portal â†’ Deploy a custom template â†’ Build your own template in the editor</w:t>
       </w:r>
     </w:p>
     <w:p>
@@ -915,10 +895,7 @@
         </w:numPr>
       </w:pPr>
       <w:r>
-        <w:t xml:space="preserve">Upload</w:t>
-      </w:r>
-      <w:r>
-        <w:t xml:space="preserve"> </w:t>
+        <w:t xml:space="preserve">Upload </w:t>
       </w:r>
       <w:r>
         <w:rPr>
@@ -927,10 +904,7 @@
         <w:t xml:space="preserve">infra/azuredeploy.json</w:t>
       </w:r>
       <w:r>
-        <w:t xml:space="preserve"> </w:t>
-      </w:r>
-      <w:r>
-        <w:t xml:space="preserve">→ Save</w:t>
+        <w:t xml:space="preserve"> â†’ Save</w:t>
       </w:r>
     </w:p>
     <w:p>
@@ -1080,10 +1054,7 @@
               <w:t xml:space="preserve">Commercial</w:t>
             </w:r>
             <w:r>
-              <w:t xml:space="preserve">,</w:t>
-            </w:r>
-            <w:r>
-              <w:t xml:space="preserve"> </w:t>
+              <w:t xml:space="preserve">, </w:t>
             </w:r>
             <w:r>
               <w:rPr>
@@ -1092,10 +1063,7 @@
               <w:t xml:space="preserve">GCC</w:t>
             </w:r>
             <w:r>
-              <w:t xml:space="preserve">,</w:t>
-            </w:r>
-            <w:r>
-              <w:t xml:space="preserve"> </w:t>
+              <w:t xml:space="preserve">, </w:t>
             </w:r>
             <w:r>
               <w:rPr>
@@ -1104,10 +1072,7 @@
               <w:t xml:space="preserve">GCCHigh</w:t>
             </w:r>
             <w:r>
-              <w:t xml:space="preserve">, or</w:t>
-            </w:r>
-            <w:r>
-              <w:t xml:space="preserve"> </w:t>
+              <w:t xml:space="preserve">, or </w:t>
             </w:r>
             <w:r>
               <w:rPr>
@@ -1137,7 +1102,7 @@
               <w:pStyle w:val="Compact"/>
             </w:pPr>
             <w:r>
-              <w:t xml:space="preserve">e.g. </w:t>
+              <w:t xml:space="preserve">e.g.Â </w:t>
             </w:r>
             <w:r>
               <w:rPr>
@@ -1173,13 +1138,7 @@
               <w:t xml:space="preserve">true</w:t>
             </w:r>
             <w:r>
-              <w:t xml:space="preserve"> </w:t>
-            </w:r>
-            <w:r>
-              <w:t xml:space="preserve">(full) or</w:t>
-            </w:r>
-            <w:r>
-              <w:t xml:space="preserve"> </w:t>
+              <w:t xml:space="preserve"> (full) or </w:t>
             </w:r>
             <w:r>
               <w:rPr>
@@ -1188,10 +1147,7 @@
               <w:t xml:space="preserve">false</w:t>
             </w:r>
             <w:r>
-              <w:t xml:space="preserve"> </w:t>
-            </w:r>
-            <w:r>
-              <w:t xml:space="preserve">(storage + SharePoint only)</w:t>
+              <w:t xml:space="preserve"> (storage + SharePoint only)</w:t>
             </w:r>
           </w:p>
         </w:tc>
@@ -1206,7 +1162,7 @@
         </w:numPr>
       </w:pPr>
       <w:r>
-        <w:t xml:space="preserve">Review + create → Create (~5-8 min)</w:t>
+        <w:t xml:space="preserve">Review + create â†’ Create (~5-8 min)</w:t>
       </w:r>
     </w:p>
     <w:bookmarkEnd w:id="14"/>
@@ -1224,10 +1180,7 @@
         <w:pStyle w:val="FirstParagraph"/>
       </w:pPr>
       <w:r>
-        <w:t xml:space="preserve">After deployment: copy</w:t>
-      </w:r>
-      <w:r>
-        <w:t xml:space="preserve"> </w:t>
+        <w:t xml:space="preserve">After deployment: copy </w:t>
       </w:r>
       <w:r>
         <w:rPr>
@@ -1236,10 +1189,7 @@
         <w:t xml:space="preserve">functionAppPrincipalId</w:t>
       </w:r>
       <w:r>
-        <w:t xml:space="preserve">,</w:t>
-      </w:r>
-      <w:r>
-        <w:t xml:space="preserve"> </w:t>
+        <w:t xml:space="preserve">, </w:t>
       </w:r>
       <w:r>
         <w:rPr>
@@ -1248,10 +1198,7 @@
         <w:t xml:space="preserve">functionAppName</w:t>
       </w:r>
       <w:r>
-        <w:t xml:space="preserve">,</w:t>
-      </w:r>
-      <w:r>
-        <w:t xml:space="preserve"> </w:t>
+        <w:t xml:space="preserve">, </w:t>
       </w:r>
       <w:r>
         <w:rPr>
@@ -1286,7 +1233,7 @@
         <w:pStyle w:val="FirstParagraph"/>
       </w:pPr>
       <w:r>
-        <w:t xml:space="preserve">Run locally — not in Cloud Shell.</w:t>
+        <w:t xml:space="preserve">Run locally â€” not in Cloud Shell.</w:t>
       </w:r>
     </w:p>
     <w:p>
@@ -1343,8 +1290,6 @@
       </w:r>
       <w:r>
         <w:br/>
-      </w:r>
-      <w:r>
         <w:br/>
       </w:r>
       <w:r>
@@ -1497,7 +1442,7 @@
         <w:pStyle w:val="FirstParagraph"/>
       </w:pPr>
       <w:r>
-        <w:t xml:space="preserve">A browser sign-in popup will appear — check your taskbar. The script grants:</w:t>
+        <w:t xml:space="preserve">A browser sign-in popup will appear â€” check your taskbar. The script grants:</w:t>
       </w:r>
     </w:p>
     <w:p>
@@ -1515,10 +1460,7 @@
         <w:t xml:space="preserve">ActivityFeed.Read</w:t>
       </w:r>
       <w:r>
-        <w:t xml:space="preserve"> </w:t>
-      </w:r>
-      <w:r>
-        <w:t xml:space="preserve">to the Function App managed identity</w:t>
+        <w:t xml:space="preserve"> to the Function App managed identity</w:t>
       </w:r>
     </w:p>
     <w:p>
@@ -1536,10 +1478,7 @@
         <w:t xml:space="preserve">Sites.Selected</w:t>
       </w:r>
       <w:r>
-        <w:t xml:space="preserve"> </w:t>
-      </w:r>
-      <w:r>
-        <w:t xml:space="preserve">(Azure AD app role) scoped to only the named site</w:t>
+        <w:t xml:space="preserve"> (Azure AD app role) scoped to only the named site</w:t>
       </w:r>
     </w:p>
     <w:p>
@@ -1592,7 +1531,7 @@
         </w:numPr>
       </w:pPr>
       <w:r>
-        <w:t xml:space="preserve">Left navigation → Audit</w:t>
+        <w:t xml:space="preserve">Left navigation â†’ Audit</w:t>
       </w:r>
     </w:p>
     <w:p>
@@ -1629,7 +1568,7 @@
         <w:pStyle w:val="FirstParagraph"/>
       </w:pPr>
       <w:r>
-        <w:t xml:space="preserve">The Function App has private endpoints — use a brief public access window:</w:t>
+        <w:t xml:space="preserve">The Function App has private endpoints â€” use a brief public access window:</w:t>
       </w:r>
     </w:p>
     <w:p>
@@ -1743,8 +1682,6 @@
       </w:r>
       <w:r>
         <w:br/>
-      </w:r>
-      <w:r>
         <w:br/>
       </w:r>
       <w:r>
@@ -1779,8 +1716,6 @@
       </w:r>
       <w:r>
         <w:br/>
-      </w:r>
-      <w:r>
         <w:br/>
       </w:r>
       <w:r>
@@ -1863,8 +1798,6 @@
       </w:r>
       <w:r>
         <w:br/>
-      </w:r>
-      <w:r>
         <w:br/>
       </w:r>
       <w:r>
@@ -1978,16 +1911,7 @@
         <w:pStyle w:val="FirstParagraph"/>
       </w:pPr>
       <w:r>
-        <w:t xml:space="preserve">This deploys all four functions:</w:t>
-      </w:r>
-      <w:r>
-        <w:t xml:space="preserve"> </w:t>
-      </w:r>
-      <w:r>
-        <w:t xml:space="preserve">-</w:t>
-      </w:r>
-      <w:r>
-        <w:t xml:space="preserve"> </w:t>
+        <w:t xml:space="preserve">This deploys all four functions: - </w:t>
       </w:r>
       <w:r>
         <w:rPr>
@@ -1997,19 +1921,7 @@
         <w:t xml:space="preserve">PullCopilotAudit</w:t>
       </w:r>
       <w:r>
-        <w:t xml:space="preserve"> </w:t>
-      </w:r>
-      <w:r>
-        <w:t xml:space="preserve">— pulls Copilot audit events from Office 365 every 15 min</w:t>
-      </w:r>
-      <w:r>
-        <w:t xml:space="preserve"> </w:t>
-      </w:r>
-      <w:r>
-        <w:t xml:space="preserve">-</w:t>
-      </w:r>
-      <w:r>
-        <w:t xml:space="preserve"> </w:t>
+        <w:t xml:space="preserve"> â€” pulls Copilot audit events from Office 365 every 15 min - </w:t>
       </w:r>
       <w:r>
         <w:rPr>
@@ -2019,19 +1931,7 @@
         <w:t xml:space="preserve">ExportAdoptionMetrics</w:t>
       </w:r>
       <w:r>
-        <w:t xml:space="preserve"> </w:t>
-      </w:r>
-      <w:r>
-        <w:t xml:space="preserve">— aggregates ADLS data into SharePoint lists every 4 hours</w:t>
-      </w:r>
-      <w:r>
-        <w:t xml:space="preserve"> </w:t>
-      </w:r>
-      <w:r>
-        <w:t xml:space="preserve">-</w:t>
-      </w:r>
-      <w:r>
-        <w:t xml:space="preserve"> </w:t>
+        <w:t xml:space="preserve"> â€” aggregates ADLS data into SharePoint lists every 4 hours - </w:t>
       </w:r>
       <w:r>
         <w:rPr>
@@ -2041,19 +1941,7 @@
         <w:t xml:space="preserve">PullSharePointAgents</w:t>
       </w:r>
       <w:r>
-        <w:t xml:space="preserve"> </w:t>
-      </w:r>
-      <w:r>
-        <w:t xml:space="preserve">— tracks SharePoint agent file creation every 15 min</w:t>
-      </w:r>
-      <w:r>
-        <w:t xml:space="preserve"> </w:t>
-      </w:r>
-      <w:r>
-        <w:t xml:space="preserve">-</w:t>
-      </w:r>
-      <w:r>
-        <w:t xml:space="preserve"> </w:t>
+        <w:t xml:space="preserve"> â€” tracks SharePoint agent file creation every 15 min - </w:t>
       </w:r>
       <w:r>
         <w:rPr>
@@ -2063,10 +1951,7 @@
         <w:t xml:space="preserve">StartSubscription</w:t>
       </w:r>
       <w:r>
-        <w:t xml:space="preserve"> </w:t>
-      </w:r>
-      <w:r>
-        <w:t xml:space="preserve">— activates the audit subscription (one-time, idempotent)</w:t>
+        <w:t xml:space="preserve"> â€” activates the audit subscription (one-time, idempotent)</w:t>
       </w:r>
     </w:p>
     <w:p>
@@ -2095,10 +1980,7 @@
         </w:numPr>
       </w:pPr>
       <w:r>
-        <w:t xml:space="preserve">Portal → Function App → App files → select</w:t>
-      </w:r>
-      <w:r>
-        <w:t xml:space="preserve"> </w:t>
+        <w:t xml:space="preserve">Portal â†’ Function App â†’ App files â†’ select </w:t>
       </w:r>
       <w:r>
         <w:rPr>
@@ -2116,10 +1998,7 @@
         </w:numPr>
       </w:pPr>
       <w:r>
-        <w:t xml:space="preserve">Replace content with:</w:t>
-      </w:r>
-      <w:r>
-        <w:t xml:space="preserve"> </w:t>
+        <w:t xml:space="preserve">Replace content with: </w:t>
       </w:r>
       <w:r>
         <w:rPr>
@@ -2162,7 +2041,7 @@
         <w:pStyle w:val="FirstParagraph"/>
       </w:pPr>
       <w:r>
-        <w:t xml:space="preserve">Portal → Functions → StartSubscription → Code + Test → Test/Run → Run</w:t>
+        <w:t xml:space="preserve">Portal â†’ Functions â†’ StartSubscription â†’ Code + Test â†’ Test/Run â†’ Run</w:t>
       </w:r>
     </w:p>
     <w:p>
@@ -2170,10 +2049,7 @@
         <w:pStyle w:val="BodyText"/>
       </w:pPr>
       <w:r>
-        <w:t xml:space="preserve">Look for</w:t>
-      </w:r>
-      <w:r>
-        <w:t xml:space="preserve"> </w:t>
+        <w:t xml:space="preserve">Look for </w:t>
       </w:r>
       <w:r>
         <w:rPr>
@@ -2182,10 +2058,7 @@
         <w:t xml:space="preserve">{"status":"enabled","contentType":"Audit.General"}</w:t>
       </w:r>
       <w:r>
-        <w:t xml:space="preserve"> </w:t>
-      </w:r>
-      <w:r>
-        <w:t xml:space="preserve">in the logs.</w:t>
+        <w:t xml:space="preserve"> in the logs.</w:t>
       </w:r>
     </w:p>
     <w:p>
@@ -2225,10 +2098,7 @@
         <w:t xml:space="preserve">To create:</w:t>
       </w:r>
       <w:r>
-        <w:t xml:space="preserve"> </w:t>
-      </w:r>
-      <w:r>
-        <w:t xml:space="preserve">Site home → New → List → Blank list → name it → Create</w:t>
+        <w:t xml:space="preserve"> Site home â†’ New â†’ List â†’ Blank list â†’ name it â†’ Create</w:t>
       </w:r>
     </w:p>
     <w:p>
@@ -2243,10 +2113,7 @@
         <w:t xml:space="preserve">To add a column:</w:t>
       </w:r>
       <w:r>
-        <w:t xml:space="preserve"> </w:t>
-      </w:r>
-      <w:r>
-        <w:t xml:space="preserve">+ Add column → select type → set name → Save</w:t>
+        <w:t xml:space="preserve"> + Add column â†’ select type â†’ set name â†’ Save</w:t>
       </w:r>
     </w:p>
     <w:p>
@@ -2261,10 +2128,7 @@
         <w:t xml:space="preserve">To hide Title column:</w:t>
       </w:r>
       <w:r>
-        <w:t xml:space="preserve"> </w:t>
-      </w:r>
-      <w:r>
-        <w:t xml:space="preserve">column header → Column settings → Hide in view</w:t>
+        <w:t xml:space="preserve"> column header â†’ Column settings â†’ Hide in view</w:t>
       </w:r>
     </w:p>
     <w:p>
@@ -2339,7 +2203,7 @@
               <w:pStyle w:val="Compact"/>
             </w:pPr>
             <w:r>
-              <w:t xml:space="preserve">Single line of text (built-in — hide)</w:t>
+              <w:t xml:space="preserve">Single line of text (built-in â€” hide)</w:t>
             </w:r>
           </w:p>
         </w:tc>
@@ -2363,7 +2227,7 @@
               <w:pStyle w:val="Compact"/>
             </w:pPr>
             <w:r>
-              <w:t xml:space="preserve">Date and time → Date only</w:t>
+              <w:t xml:space="preserve">Date and time â†’ Date only</w:t>
             </w:r>
           </w:p>
         </w:tc>
@@ -2507,7 +2371,7 @@
               <w:pStyle w:val="Compact"/>
             </w:pPr>
             <w:r>
-              <w:t xml:space="preserve">Single line of text (built-in — hide)</w:t>
+              <w:t xml:space="preserve">Single line of text (built-in â€” hide)</w:t>
             </w:r>
           </w:p>
         </w:tc>
@@ -2531,7 +2395,7 @@
               <w:pStyle w:val="Compact"/>
             </w:pPr>
             <w:r>
-              <w:t xml:space="preserve">Date and time → Date only</w:t>
+              <w:t xml:space="preserve">Date and time â†’ Date only</w:t>
             </w:r>
           </w:p>
         </w:tc>
@@ -2675,7 +2539,7 @@
               <w:pStyle w:val="Compact"/>
             </w:pPr>
             <w:r>
-              <w:t xml:space="preserve">Single line of text (built-in — hide)</w:t>
+              <w:t xml:space="preserve">Single line of text (built-in â€” hide)</w:t>
             </w:r>
           </w:p>
         </w:tc>
@@ -2699,7 +2563,7 @@
               <w:pStyle w:val="Compact"/>
             </w:pPr>
             <w:r>
-              <w:t xml:space="preserve">Date and time → Date only</w:t>
+              <w:t xml:space="preserve">Date and time â†’ Date only</w:t>
             </w:r>
           </w:p>
         </w:tc>
@@ -2723,7 +2587,7 @@
               <w:pStyle w:val="Compact"/>
             </w:pPr>
             <w:r>
-              <w:t xml:space="preserve">Date and time → Date only</w:t>
+              <w:t xml:space="preserve">Date and time â†’ Date only</w:t>
             </w:r>
           </w:p>
         </w:tc>
@@ -2891,7 +2755,7 @@
               <w:pStyle w:val="Compact"/>
             </w:pPr>
             <w:r>
-              <w:t xml:space="preserve">Single line of text (built-in — hide)</w:t>
+              <w:t xml:space="preserve">Single line of text (built-in â€” hide)</w:t>
             </w:r>
           </w:p>
         </w:tc>
@@ -2915,7 +2779,7 @@
               <w:pStyle w:val="Compact"/>
             </w:pPr>
             <w:r>
-              <w:t xml:space="preserve">Date and time → Date only</w:t>
+              <w:t xml:space="preserve">Date and time â†’ Date only</w:t>
             </w:r>
           </w:p>
         </w:tc>
@@ -3008,10 +2872,7 @@
         <w:pStyle w:val="FirstParagraph"/>
       </w:pPr>
       <w:r>
-        <w:t xml:space="preserve">A permanent, append-only running log of every Copilot agent created in SharePoint. Populated automatically by</w:t>
-      </w:r>
-      <w:r>
-        <w:t xml:space="preserve"> </w:t>
+        <w:t xml:space="preserve">A permanent, append-only running log of every Copilot agent created in SharePoint. Populated automatically by </w:t>
       </w:r>
       <w:r>
         <w:rPr>
@@ -3079,7 +2940,7 @@
               <w:pStyle w:val="Compact"/>
             </w:pPr>
             <w:r>
-              <w:t xml:space="preserve">Single line of text (built-in — hide)</w:t>
+              <w:t xml:space="preserve">Single line of text (built-in â€” hide)</w:t>
             </w:r>
           </w:p>
         </w:tc>
@@ -3228,7 +3089,7 @@
         <w:pStyle w:val="FirstParagraph"/>
       </w:pPr>
       <w:r>
-        <w:t xml:space="preserve">Portal → Function App → Settings → Environment variables → + Add each → Apply → Confirm</w:t>
+        <w:t xml:space="preserve">Portal â†’ Function App â†’ Settings â†’ Environment variables â†’ + Add each â†’ Apply â†’ Confirm</w:t>
       </w:r>
     </w:p>
     <w:tbl>
@@ -3555,13 +3416,7 @@
               <w:t xml:space="preserve">90</w:t>
             </w:r>
             <w:r>
-              <w:t xml:space="preserve"> </w:t>
-            </w:r>
-            <w:r>
-              <w:t xml:space="preserve">(change to</w:t>
-            </w:r>
-            <w:r>
-              <w:t xml:space="preserve"> </w:t>
+              <w:t xml:space="preserve"> (change to </w:t>
             </w:r>
             <w:r>
               <w:rPr>
@@ -3570,10 +3425,7 @@
               <w:t xml:space="preserve">7</w:t>
             </w:r>
             <w:r>
-              <w:t xml:space="preserve"> </w:t>
-            </w:r>
-            <w:r>
-              <w:t xml:space="preserve">after first run)</w:t>
+              <w:t xml:space="preserve"> after first run)</w:t>
             </w:r>
           </w:p>
         </w:tc>
@@ -3642,10 +3494,7 @@
         <w:t xml:space="preserve">DCE_INGESTION_URI</w:t>
       </w:r>
       <w:r>
-        <w:t xml:space="preserve">,</w:t>
-      </w:r>
-      <w:r>
-        <w:t xml:space="preserve"> </w:t>
+        <w:t xml:space="preserve">, </w:t>
       </w:r>
       <w:r>
         <w:rPr>
@@ -3654,10 +3503,7 @@
         <w:t xml:space="preserve">DCR_IMMUTABLE_ID</w:t>
       </w:r>
       <w:r>
-        <w:t xml:space="preserve">,</w:t>
-      </w:r>
-      <w:r>
-        <w:t xml:space="preserve"> </w:t>
+        <w:t xml:space="preserve">, </w:t>
       </w:r>
       <w:r>
         <w:rPr>
@@ -3666,10 +3512,7 @@
         <w:t xml:space="preserve">STREAM_NAME</w:t>
       </w:r>
       <w:r>
-        <w:t xml:space="preserve">, and</w:t>
-      </w:r>
-      <w:r>
-        <w:t xml:space="preserve"> </w:t>
+        <w:t xml:space="preserve">, and </w:t>
       </w:r>
       <w:r>
         <w:rPr>
@@ -3678,13 +3521,7 @@
         <w:t xml:space="preserve">APPLICATIONINSIGHTS_CONNECTION_STRING</w:t>
       </w:r>
       <w:r>
-        <w:t xml:space="preserve"> </w:t>
-      </w:r>
-      <w:r>
-        <w:t xml:space="preserve">are set automatically by the ARM deployment (empty strings when</w:t>
-      </w:r>
-      <w:r>
-        <w:t xml:space="preserve"> </w:t>
+        <w:t xml:space="preserve"> are set automatically by the ARM deployment (empty strings when </w:t>
       </w:r>
       <w:r>
         <w:rPr>
@@ -3727,7 +3564,7 @@
         <w:pStyle w:val="FirstParagraph"/>
       </w:pPr>
       <w:r>
-        <w:t xml:space="preserve">Portal → Functions → ExportAdoptionMetrics → Code + Test → Test/Run → Run</w:t>
+        <w:t xml:space="preserve">Portal â†’ Functions â†’ ExportAdoptionMetrics â†’ Code + Test â†’ Test/Run â†’ Run</w:t>
       </w:r>
     </w:p>
     <w:p>
@@ -3735,10 +3572,7 @@
         <w:pStyle w:val="BodyText"/>
       </w:pPr>
       <w:r>
-        <w:t xml:space="preserve">After first run, reset</w:t>
-      </w:r>
-      <w:r>
-        <w:t xml:space="preserve"> </w:t>
+        <w:t xml:space="preserve">After first run, reset </w:t>
       </w:r>
       <w:r>
         <w:rPr>
@@ -3747,13 +3581,7 @@
         <w:t xml:space="preserve">METRICS_LOOKBACK_DAYS</w:t>
       </w:r>
       <w:r>
-        <w:t xml:space="preserve"> </w:t>
-      </w:r>
-      <w:r>
-        <w:t xml:space="preserve">to</w:t>
-      </w:r>
-      <w:r>
-        <w:t xml:space="preserve"> </w:t>
+        <w:t xml:space="preserve"> to </w:t>
       </w:r>
       <w:r>
         <w:rPr>
@@ -3780,7 +3608,7 @@
         <w:pStyle w:val="FirstParagraph"/>
       </w:pPr>
       <w:r>
-        <w:t xml:space="preserve">Portal → Functions → PullSharePointAgents → Code + Test → Test/Run → Run</w:t>
+        <w:t xml:space="preserve">Portal â†’ Functions â†’ PullSharePointAgents â†’ Code + Test â†’ Test/Run â†’ Run</w:t>
       </w:r>
     </w:p>
     <w:p>
@@ -3788,16 +3616,7 @@
         <w:pStyle w:val="BodyText"/>
       </w:pPr>
       <w:r>
-        <w:t xml:space="preserve">This function:</w:t>
-      </w:r>
-      <w:r>
-        <w:t xml:space="preserve"> </w:t>
-      </w:r>
-      <w:r>
-        <w:t xml:space="preserve">1. Starts the</w:t>
-      </w:r>
-      <w:r>
-        <w:t xml:space="preserve"> </w:t>
+        <w:t xml:space="preserve">This function: 1. Starts the </w:t>
       </w:r>
       <w:r>
         <w:rPr>
@@ -3806,19 +3625,7 @@
         <w:t xml:space="preserve">Audit.SharePoint</w:t>
       </w:r>
       <w:r>
-        <w:t xml:space="preserve"> </w:t>
-      </w:r>
-      <w:r>
-        <w:t xml:space="preserve">subscription if not already active</w:t>
-      </w:r>
-      <w:r>
-        <w:t xml:space="preserve"> </w:t>
-      </w:r>
-      <w:r>
-        <w:t xml:space="preserve">2. Scans the configured time window for</w:t>
-      </w:r>
-      <w:r>
-        <w:t xml:space="preserve"> </w:t>
+        <w:t xml:space="preserve"> subscription if not already active 2. Scans the configured time window for </w:t>
       </w:r>
       <w:r>
         <w:rPr>
@@ -3827,19 +3634,7 @@
         <w:t xml:space="preserve">.agent</w:t>
       </w:r>
       <w:r>
-        <w:t xml:space="preserve"> </w:t>
-      </w:r>
-      <w:r>
-        <w:t xml:space="preserve">file uploads</w:t>
-      </w:r>
-      <w:r>
-        <w:t xml:space="preserve"> </w:t>
-      </w:r>
-      <w:r>
-        <w:t xml:space="preserve">3. Appends any new agents to</w:t>
-      </w:r>
-      <w:r>
-        <w:t xml:space="preserve"> </w:t>
+        <w:t xml:space="preserve"> file uploads 3. Appends any new agents to </w:t>
       </w:r>
       <w:r>
         <w:rPr>
@@ -3853,10 +3648,7 @@
         <w:pStyle w:val="BodyText"/>
       </w:pPr>
       <w:r>
-        <w:t xml:space="preserve">If agents were created before deployment, temporarily increase</w:t>
-      </w:r>
-      <w:r>
-        <w:t xml:space="preserve"> </w:t>
+        <w:t xml:space="preserve">If agents were created before deployment, temporarily increase </w:t>
       </w:r>
       <w:r>
         <w:rPr>
@@ -3865,10 +3657,7 @@
         <w:t xml:space="preserve">TIME_WINDOW_MINUTES</w:t>
       </w:r>
       <w:r>
-        <w:t xml:space="preserve"> </w:t>
-      </w:r>
-      <w:r>
-        <w:t xml:space="preserve">(e.g. </w:t>
+        <w:t xml:space="preserve"> (e.g.Â </w:t>
       </w:r>
       <w:r>
         <w:rPr>
@@ -3877,10 +3666,7 @@
         <w:t xml:space="preserve">500</w:t>
       </w:r>
       <w:r>
-        <w:t xml:space="preserve">) to backfill, then reset to</w:t>
-      </w:r>
-      <w:r>
-        <w:t xml:space="preserve"> </w:t>
+        <w:t xml:space="preserve">) to backfill, then reset to </w:t>
       </w:r>
       <w:r>
         <w:rPr>
@@ -3897,10 +3683,7 @@
         <w:pStyle w:val="BodyText"/>
       </w:pPr>
       <w:r>
-        <w:t xml:space="preserve">The registry is</w:t>
-      </w:r>
-      <w:r>
-        <w:t xml:space="preserve"> </w:t>
+        <w:t xml:space="preserve">The registry is </w:t>
       </w:r>
       <w:r>
         <w:rPr>
@@ -3910,13 +3693,7 @@
         <w:t xml:space="preserve">append-only</w:t>
       </w:r>
       <w:r>
-        <w:t xml:space="preserve"> </w:t>
-      </w:r>
-      <w:r>
-        <w:t xml:space="preserve">— it never deletes or overwrites entries. Running it multiple times is safe due to deduplication by</w:t>
-      </w:r>
-      <w:r>
-        <w:t xml:space="preserve"> </w:t>
+        <w:t xml:space="preserve"> â€” it never deletes or overwrites entries. Running it multiple times is safe due to deduplication by </w:t>
       </w:r>
       <w:r>
         <w:rPr>
@@ -3987,7 +3764,7 @@
         </w:numPr>
       </w:pPr>
       <w:r>
-        <w:t xml:space="preserve">https://make.powerapps.com → + Create → Start with data → SharePoint</w:t>
+        <w:t xml:space="preserve">https://make.powerapps.com â†’ + Create â†’ Start with data â†’ SharePoint</w:t>
       </w:r>
     </w:p>
     <w:p>
@@ -3999,10 +3776,7 @@
         </w:numPr>
       </w:pPr>
       <w:r>
-        <w:t xml:space="preserve">Connect to your site → pick</w:t>
-      </w:r>
-      <w:r>
-        <w:t xml:space="preserve"> </w:t>
+        <w:t xml:space="preserve">Connect to your site â†’ pick </w:t>
       </w:r>
       <w:r>
         <w:rPr>
@@ -4032,7 +3806,7 @@
         </w:numPr>
       </w:pPr>
       <w:r>
-        <w:t xml:space="preserve">Build screens, File → Save → Publish</w:t>
+        <w:t xml:space="preserve">Build screens, File â†’ Save â†’ Publish</w:t>
       </w:r>
     </w:p>
     <w:p>
@@ -4069,10 +3843,7 @@
         <w:pStyle w:val="BlockText"/>
       </w:pPr>
       <w:r>
-        <w:t xml:space="preserve">Skip if deployed with</w:t>
-      </w:r>
-      <w:r>
-        <w:t xml:space="preserve"> </w:t>
+        <w:t xml:space="preserve">Skip if deployed with </w:t>
       </w:r>
       <w:r>
         <w:rPr>
@@ -4093,7 +3864,7 @@
         </w:numPr>
       </w:pPr>
       <w:r>
-        <w:t xml:space="preserve">Portal → Azure Monitor → Workbooks → + New → Edit</w:t>
+        <w:t xml:space="preserve">Portal â†’ Azure Monitor â†’ Workbooks â†’ + New â†’ Edit</w:t>
       </w:r>
     </w:p>
     <w:p>
@@ -4105,10 +3876,7 @@
         </w:numPr>
       </w:pPr>
       <w:r>
-        <w:t xml:space="preserve">Advanced Editor → paste</w:t>
-      </w:r>
-      <w:r>
-        <w:t xml:space="preserve"> </w:t>
+        <w:t xml:space="preserve">Advanced Editor â†’ paste </w:t>
       </w:r>
       <w:r>
         <w:rPr>
@@ -4126,13 +3894,7 @@
         </w:numPr>
       </w:pPr>
       <w:r>
-        <w:t xml:space="preserve">Apply → Save as</w:t>
-      </w:r>
-      <w:r>
-        <w:t xml:space="preserve"> </w:t>
-      </w:r>
-      <w:r>
-        <w:t xml:space="preserve">“Copilot Adoption Dashboard”</w:t>
+        <w:t>Apply â†’ Save as “Copilot Adoption Dashboard”</w:t>
       </w:r>
     </w:p>
     <w:p>
@@ -4149,7 +3911,7 @@
         <w:pStyle w:val="Heading1"/>
       </w:pPr>
       <w:r>
-        <w:t xml:space="preserve">Agent Tracking — How It Works</w:t>
+        <w:t xml:space="preserve">Agent Tracking â€” How It Works</w:t>
       </w:r>
     </w:p>
     <w:p>
@@ -4157,10 +3919,7 @@
         <w:pStyle w:val="FirstParagraph"/>
       </w:pPr>
       <w:r>
-        <w:t xml:space="preserve">SharePoint Copilot agents are stored as</w:t>
-      </w:r>
-      <w:r>
-        <w:t xml:space="preserve"> </w:t>
+        <w:t xml:space="preserve">SharePoint Copilot agents are stored as </w:t>
       </w:r>
       <w:r>
         <w:rPr>
@@ -4169,13 +3928,7 @@
         <w:t xml:space="preserve">.agent</w:t>
       </w:r>
       <w:r>
-        <w:t xml:space="preserve"> </w:t>
-      </w:r>
-      <w:r>
-        <w:t xml:space="preserve">files in SharePoint document libraries. When a user creates an agent, SharePoint logs a</w:t>
-      </w:r>
-      <w:r>
-        <w:t xml:space="preserve"> </w:t>
+        <w:t xml:space="preserve"> files in SharePoint document libraries. When a user creates an agent, SharePoint logs a </w:t>
       </w:r>
       <w:r>
         <w:rPr>
@@ -4184,13 +3937,7 @@
         <w:t xml:space="preserve">FileUploaded</w:t>
       </w:r>
       <w:r>
-        <w:t xml:space="preserve"> </w:t>
-      </w:r>
-      <w:r>
-        <w:t xml:space="preserve">event in</w:t>
-      </w:r>
-      <w:r>
-        <w:t xml:space="preserve"> </w:t>
+        <w:t xml:space="preserve"> event in </w:t>
       </w:r>
       <w:r>
         <w:rPr>
@@ -4199,13 +3946,7 @@
         <w:t xml:space="preserve">Audit.SharePoint</w:t>
       </w:r>
       <w:r>
-        <w:t xml:space="preserve"> </w:t>
-      </w:r>
-      <w:r>
-        <w:t xml:space="preserve">with</w:t>
-      </w:r>
-      <w:r>
-        <w:t xml:space="preserve"> </w:t>
+        <w:t xml:space="preserve"> with </w:t>
       </w:r>
       <w:r>
         <w:rPr>
@@ -4228,13 +3969,7 @@
         <w:t xml:space="preserve">PullSharePointAgents</w:t>
       </w:r>
       <w:r>
-        <w:t xml:space="preserve"> </w:t>
-      </w:r>
-      <w:r>
-        <w:t xml:space="preserve">subscribes to</w:t>
-      </w:r>
-      <w:r>
-        <w:t xml:space="preserve"> </w:t>
+        <w:t xml:space="preserve"> subscribes to </w:t>
       </w:r>
       <w:r>
         <w:rPr>
@@ -4243,19 +3978,7 @@
         <w:t xml:space="preserve">Audit.SharePoint</w:t>
       </w:r>
       <w:r>
-        <w:t xml:space="preserve"> </w:t>
-      </w:r>
-      <w:r>
-        <w:t xml:space="preserve">and filters these events, capturing:</w:t>
-      </w:r>
-      <w:r>
-        <w:t xml:space="preserve"> </w:t>
-      </w:r>
-      <w:r>
-        <w:t xml:space="preserve">-</w:t>
-      </w:r>
-      <w:r>
-        <w:t xml:space="preserve"> </w:t>
+        <w:t xml:space="preserve"> and filters these events, capturing: - </w:t>
       </w:r>
       <w:r>
         <w:rPr>
@@ -4265,10 +3988,7 @@
         <w:t xml:space="preserve">AgentName</w:t>
       </w:r>
       <w:r>
-        <w:t xml:space="preserve"> </w:t>
-      </w:r>
-      <w:r>
-        <w:t xml:space="preserve">— derived from the filename (e.g. </w:t>
+        <w:t xml:space="preserve"> â€” derived from the filename (e.g.Â </w:t>
       </w:r>
       <w:r>
         <w:rPr>
@@ -4277,16 +3997,7 @@
         <w:t xml:space="preserve">CopilotAdoption agent</w:t>
       </w:r>
       <w:r>
-        <w:t xml:space="preserve">)</w:t>
-      </w:r>
-      <w:r>
-        <w:t xml:space="preserve"> </w:t>
-      </w:r>
-      <w:r>
-        <w:t xml:space="preserve">-</w:t>
-      </w:r>
-      <w:r>
-        <w:t xml:space="preserve"> </w:t>
+        <w:t xml:space="preserve">) - </w:t>
       </w:r>
       <w:r>
         <w:rPr>
@@ -4296,19 +4007,7 @@
         <w:t xml:space="preserve">SiteUrl</w:t>
       </w:r>
       <w:r>
-        <w:t xml:space="preserve"> </w:t>
-      </w:r>
-      <w:r>
-        <w:t xml:space="preserve">— the SharePoint site where the agent was created</w:t>
-      </w:r>
-      <w:r>
-        <w:t xml:space="preserve"> </w:t>
-      </w:r>
-      <w:r>
-        <w:t xml:space="preserve">-</w:t>
-      </w:r>
-      <w:r>
-        <w:t xml:space="preserve"> </w:t>
+        <w:t xml:space="preserve"> â€” the SharePoint site where the agent was created - </w:t>
       </w:r>
       <w:r>
         <w:rPr>
@@ -4318,13 +4017,7 @@
         <w:t xml:space="preserve">AgentFileUrl</w:t>
       </w:r>
       <w:r>
-        <w:t xml:space="preserve"> </w:t>
-      </w:r>
-      <w:r>
-        <w:t xml:space="preserve">— full path to the</w:t>
-      </w:r>
-      <w:r>
-        <w:t xml:space="preserve"> </w:t>
+        <w:t xml:space="preserve"> â€” full path to the </w:t>
       </w:r>
       <w:r>
         <w:rPr>
@@ -4333,19 +4026,7 @@
         <w:t xml:space="preserve">.agent</w:t>
       </w:r>
       <w:r>
-        <w:t xml:space="preserve"> </w:t>
-      </w:r>
-      <w:r>
-        <w:t xml:space="preserve">file</w:t>
-      </w:r>
-      <w:r>
-        <w:t xml:space="preserve"> </w:t>
-      </w:r>
-      <w:r>
-        <w:t xml:space="preserve">-</w:t>
-      </w:r>
-      <w:r>
-        <w:t xml:space="preserve"> </w:t>
+        <w:t xml:space="preserve"> file - </w:t>
       </w:r>
       <w:r>
         <w:rPr>
@@ -4355,19 +4036,7 @@
         <w:t xml:space="preserve">CreatedBy</w:t>
       </w:r>
       <w:r>
-        <w:t xml:space="preserve"> </w:t>
-      </w:r>
-      <w:r>
-        <w:t xml:space="preserve">— UPN of the user who created it</w:t>
-      </w:r>
-      <w:r>
-        <w:t xml:space="preserve"> </w:t>
-      </w:r>
-      <w:r>
-        <w:t xml:space="preserve">-</w:t>
-      </w:r>
-      <w:r>
-        <w:t xml:space="preserve"> </w:t>
+        <w:t xml:space="preserve"> â€” UPN of the user who created it - </w:t>
       </w:r>
       <w:r>
         <w:rPr>
@@ -4377,10 +4046,7 @@
         <w:t xml:space="preserve">CreatedDate</w:t>
       </w:r>
       <w:r>
-        <w:t xml:space="preserve"> </w:t>
-      </w:r>
-      <w:r>
-        <w:t xml:space="preserve">— timestamp of creation</w:t>
+        <w:t xml:space="preserve"> â€” timestamp of creation</w:t>
       </w:r>
     </w:p>
     <w:p>
@@ -4388,10 +4054,7 @@
         <w:pStyle w:val="BodyText"/>
       </w:pPr>
       <w:r>
-        <w:t xml:space="preserve">When users</w:t>
-      </w:r>
-      <w:r>
-        <w:t xml:space="preserve"> </w:t>
+        <w:t xml:space="preserve">When users </w:t>
       </w:r>
       <w:r>
         <w:rPr>
@@ -4401,13 +4064,7 @@
         <w:t xml:space="preserve">interact</w:t>
       </w:r>
       <w:r>
-        <w:t xml:space="preserve"> </w:t>
-      </w:r>
-      <w:r>
-        <w:t xml:space="preserve">with a named SharePoint agent, the</w:t>
-      </w:r>
-      <w:r>
-        <w:t xml:space="preserve"> </w:t>
+        <w:t xml:space="preserve"> with a named SharePoint agent, the </w:t>
       </w:r>
       <w:r>
         <w:rPr>
@@ -4416,13 +4073,7 @@
         <w:t xml:space="preserve">Audit.General</w:t>
       </w:r>
       <w:r>
-        <w:t xml:space="preserve"> </w:t>
-      </w:r>
-      <w:r>
-        <w:t xml:space="preserve">events (captured by</w:t>
-      </w:r>
-      <w:r>
-        <w:t xml:space="preserve"> </w:t>
+        <w:t xml:space="preserve"> events (captured by </w:t>
       </w:r>
       <w:r>
         <w:rPr>
@@ -4431,10 +4082,7 @@
         <w:t xml:space="preserve">PullCopilotAudit</w:t>
       </w:r>
       <w:r>
-        <w:t xml:space="preserve">) include</w:t>
-      </w:r>
-      <w:r>
-        <w:t xml:space="preserve"> </w:t>
+        <w:t xml:space="preserve">) include </w:t>
       </w:r>
       <w:r>
         <w:rPr>
@@ -4443,13 +4091,7 @@
         <w:t xml:space="preserve">TargetAgentName</w:t>
       </w:r>
       <w:r>
-        <w:t xml:space="preserve"> </w:t>
-      </w:r>
-      <w:r>
-        <w:t xml:space="preserve">in</w:t>
-      </w:r>
-      <w:r>
-        <w:t xml:space="preserve"> </w:t>
+        <w:t xml:space="preserve"> in </w:t>
       </w:r>
       <w:r>
         <w:rPr>
@@ -4458,10 +4100,7 @@
         <w:t xml:space="preserve">CopilotEventData</w:t>
       </w:r>
       <w:r>
-        <w:t xml:space="preserve">. These interactions are counted in</w:t>
-      </w:r>
-      <w:r>
-        <w:t xml:space="preserve"> </w:t>
+        <w:t xml:space="preserve">. These interactions are counted in </w:t>
       </w:r>
       <w:r>
         <w:rPr>
@@ -4470,13 +4109,7 @@
         <w:t xml:space="preserve">CopilotAppMetrics</w:t>
       </w:r>
       <w:r>
-        <w:t xml:space="preserve"> </w:t>
-      </w:r>
-      <w:r>
-        <w:t xml:space="preserve">under</w:t>
-      </w:r>
-      <w:r>
-        <w:t xml:space="preserve"> </w:t>
+        <w:t xml:space="preserve"> under </w:t>
       </w:r>
       <w:r>
         <w:rPr>
@@ -4485,10 +4118,7 @@
         <w:t xml:space="preserve">AppHost: SharePoint</w:t>
       </w:r>
       <w:r>
-        <w:t xml:space="preserve"> </w:t>
-      </w:r>
-      <w:r>
-        <w:t xml:space="preserve">and will be broken out by agent name in future versions.</w:t>
+        <w:t xml:space="preserve"> and will be broken out by agent name in future versions.</w:t>
       </w:r>
     </w:p>
     <w:p>
@@ -4503,13 +4133,7 @@
         <w:t xml:space="preserve">Note:</w:t>
       </w:r>
       <w:r>
-        <w:t xml:space="preserve"> </w:t>
-      </w:r>
-      <w:r>
-        <w:t xml:space="preserve">The</w:t>
-      </w:r>
-      <w:r>
-        <w:t xml:space="preserve"> </w:t>
+        <w:t xml:space="preserve"> The </w:t>
       </w:r>
       <w:r>
         <w:rPr>
@@ -4518,13 +4142,7 @@
         <w:t xml:space="preserve">Contexts</w:t>
       </w:r>
       <w:r>
-        <w:t xml:space="preserve"> </w:t>
-      </w:r>
-      <w:r>
-        <w:t xml:space="preserve">field in SharePoint Copilot interaction events is empty in the current audit schema — the page URL where the agent is deployed is not logged in interaction events. The agent’s site is only available at creation time via</w:t>
-      </w:r>
-      <w:r>
-        <w:t xml:space="preserve"> </w:t>
+        <w:t xml:space="preserve"> field in SharePoint Copilot interaction events is empty in the current audit schema â€” the page URL where the agent is deployed is not logged in interaction events. The agent’s site is only available at creation time via </w:t>
       </w:r>
       <w:r>
         <w:rPr>
@@ -4567,10 +4185,7 @@
         <w:pStyle w:val="FirstParagraph"/>
       </w:pPr>
       <w:r>
-        <w:t xml:space="preserve">The saved state timestamp exceeds 24 hours. The code auto-caps at 23 h — self-heals on next run. To force a reset, delete</w:t>
-      </w:r>
-      <w:r>
-        <w:t xml:space="preserve"> </w:t>
+        <w:t xml:space="preserve">The saved state timestamp exceeds 24 hours. The code auto-caps at 23 h â€” self-heals on next run. To force a reset, delete </w:t>
       </w:r>
       <w:r>
         <w:rPr>
@@ -4579,13 +4194,7 @@
         <w:t xml:space="preserve">_state/lastProcessed.txt</w:t>
       </w:r>
       <w:r>
-        <w:t xml:space="preserve"> </w:t>
-      </w:r>
-      <w:r>
-        <w:t xml:space="preserve">from the</w:t>
-      </w:r>
-      <w:r>
-        <w:t xml:space="preserve"> </w:t>
+        <w:t xml:space="preserve"> from the </w:t>
       </w:r>
       <w:r>
         <w:rPr>
@@ -4594,10 +4203,7 @@
         <w:t xml:space="preserve">copilot-logs</w:t>
       </w:r>
       <w:r>
-        <w:t xml:space="preserve"> </w:t>
-      </w:r>
-      <w:r>
-        <w:t xml:space="preserve">container.</w:t>
+        <w:t xml:space="preserve"> container.</w:t>
       </w:r>
     </w:p>
     <w:bookmarkEnd w:id="35"/>
@@ -4615,10 +4221,7 @@
         <w:pStyle w:val="FirstParagraph"/>
       </w:pPr>
       <w:r>
-        <w:t xml:space="preserve">Check that</w:t>
-      </w:r>
-      <w:r>
-        <w:t xml:space="preserve"> </w:t>
+        <w:t xml:space="preserve">Check that </w:t>
       </w:r>
       <w:r>
         <w:rPr>
@@ -4627,13 +4230,7 @@
         <w:t xml:space="preserve">PullCopilotAudit</w:t>
       </w:r>
       <w:r>
-        <w:t xml:space="preserve"> </w:t>
-      </w:r>
-      <w:r>
-        <w:t xml:space="preserve">has run and blobs exist in</w:t>
-      </w:r>
-      <w:r>
-        <w:t xml:space="preserve"> </w:t>
+        <w:t xml:space="preserve"> has run and blobs exist in </w:t>
       </w:r>
       <w:r>
         <w:rPr>
@@ -4642,13 +4239,7 @@
         <w:t xml:space="preserve">copilot-logs</w:t>
       </w:r>
       <w:r>
-        <w:t xml:space="preserve"> </w:t>
-      </w:r>
-      <w:r>
-        <w:t xml:space="preserve">under</w:t>
-      </w:r>
-      <w:r>
-        <w:t xml:space="preserve"> </w:t>
+        <w:t xml:space="preserve"> under </w:t>
       </w:r>
       <w:r>
         <w:rPr>
@@ -4657,10 +4248,7 @@
         <w:t xml:space="preserve">yyyy/MM/dd/</w:t>
       </w:r>
       <w:r>
-        <w:t xml:space="preserve"> </w:t>
-      </w:r>
-      <w:r>
-        <w:t xml:space="preserve">folders.</w:t>
+        <w:t xml:space="preserve"> folders.</w:t>
       </w:r>
     </w:p>
     <w:bookmarkEnd w:id="36"/>
@@ -4700,10 +4288,7 @@
         </w:numPr>
       </w:pPr>
       <w:r>
-        <w:t xml:space="preserve">Confirm</w:t>
-      </w:r>
-      <w:r>
-        <w:t xml:space="preserve"> </w:t>
+        <w:t xml:space="preserve">Confirm </w:t>
       </w:r>
       <w:r>
         <w:rPr>
@@ -4712,10 +4297,7 @@
         <w:t xml:space="preserve">SHAREPOINT_AGENT_LIST = SharePointCopilotAgentRegistry</w:t>
       </w:r>
       <w:r>
-        <w:t xml:space="preserve"> </w:t>
-      </w:r>
-      <w:r>
-        <w:t xml:space="preserve">is set</w:t>
+        <w:t xml:space="preserve"> is set</w:t>
       </w:r>
     </w:p>
     <w:p>
@@ -4727,10 +4309,7 @@
         </w:numPr>
       </w:pPr>
       <w:r>
-        <w:t xml:space="preserve">Run</w:t>
-      </w:r>
-      <w:r>
-        <w:t xml:space="preserve"> </w:t>
+        <w:t xml:space="preserve">Run </w:t>
       </w:r>
       <w:r>
         <w:rPr>
@@ -4739,13 +4318,7 @@
         <w:t xml:space="preserve">PullSharePointAgents</w:t>
       </w:r>
       <w:r>
-        <w:t xml:space="preserve"> </w:t>
-      </w:r>
-      <w:r>
-        <w:t xml:space="preserve">with</w:t>
-      </w:r>
-      <w:r>
-        <w:t xml:space="preserve"> </w:t>
+        <w:t xml:space="preserve"> with </w:t>
       </w:r>
       <w:r>
         <w:rPr>
@@ -4754,10 +4327,7 @@
         <w:t xml:space="preserve">TIME_WINDOW_MINUTES</w:t>
       </w:r>
       <w:r>
-        <w:t xml:space="preserve"> </w:t>
-      </w:r>
-      <w:r>
-        <w:t xml:space="preserve">wide enough to cover agent creation time</w:t>
+        <w:t xml:space="preserve"> wide enough to cover agent creation time</w:t>
       </w:r>
     </w:p>
     <w:p>
@@ -4769,19 +4339,7 @@
         </w:numPr>
       </w:pPr>
       <w:r>
-        <w:t xml:space="preserve">Check logs for</w:t>
-      </w:r>
-      <w:r>
-        <w:t xml:space="preserve"> </w:t>
-      </w:r>
-      <w:r>
-        <w:t xml:space="preserve">“Found 0 Audit.SharePoint blob(s)”</w:t>
-      </w:r>
-      <w:r>
-        <w:t xml:space="preserve"> </w:t>
-      </w:r>
-      <w:r>
-        <w:t xml:space="preserve">— this means the subscription may not have been active at creation time; future creations will be captured automatically</w:t>
+        <w:t>Check logs for “Found 0 Audit.SharePoint blob(s)” â€” this means the subscription may not have been active at creation time; future creations will be captured automatically</w:t>
       </w:r>
     </w:p>
     <w:bookmarkEnd w:id="38"/>
@@ -4799,10 +4357,7 @@
         <w:pStyle w:val="FirstParagraph"/>
       </w:pPr>
       <w:r>
-        <w:t xml:space="preserve">The metrics lists are fully cleared and rewritten on every</w:t>
-      </w:r>
-      <w:r>
-        <w:t xml:space="preserve"> </w:t>
+        <w:t xml:space="preserve">The metrics lists are fully cleared and rewritten on every </w:t>
       </w:r>
       <w:r>
         <w:rPr>
@@ -4811,10 +4366,7 @@
         <w:t xml:space="preserve">ExportAdoptionMetrics</w:t>
       </w:r>
       <w:r>
-        <w:t xml:space="preserve"> </w:t>
-      </w:r>
-      <w:r>
-        <w:t xml:space="preserve">run. If you see duplicates, manually delete all items from the affected lists and run once — the function will produce a clean single copy.</w:t>
+        <w:t xml:space="preserve"> run. If you see duplicates, manually delete all items from the affected lists and run once â€” the function will produce a clean single copy.</w:t>
       </w:r>
     </w:p>
     <w:p>
@@ -5152,10 +4704,7 @@
               <w:t xml:space="preserve">Commercial</w:t>
             </w:r>
             <w:r>
-              <w:t xml:space="preserve">,</w:t>
-            </w:r>
-            <w:r>
-              <w:t xml:space="preserve"> </w:t>
+              <w:t xml:space="preserve">, </w:t>
             </w:r>
             <w:r>
               <w:rPr>
@@ -5164,10 +4713,7 @@
               <w:t xml:space="preserve">GCC</w:t>
             </w:r>
             <w:r>
-              <w:t xml:space="preserve">,</w:t>
-            </w:r>
-            <w:r>
-              <w:t xml:space="preserve"> </w:t>
+              <w:t xml:space="preserve">, </w:t>
             </w:r>
             <w:r>
               <w:rPr>
@@ -5176,10 +4722,7 @@
               <w:t xml:space="preserve">GCCHigh</w:t>
             </w:r>
             <w:r>
-              <w:t xml:space="preserve">, or</w:t>
-            </w:r>
-            <w:r>
-              <w:t xml:space="preserve"> </w:t>
+              <w:t xml:space="preserve">, or </w:t>
             </w:r>
             <w:r>
               <w:rPr>

</xml_diff>

<commit_message>
docs: add PullCopilotStudioAgents to implementation guide (Step 4 fifth function, List 6 CopilotStudioAgentRegistry, Step 8 env vars)
</commit_message>
<xml_diff>
--- a/Full_Implementation_Guide_No_Bicep.docx
+++ b/Full_Implementation_Guide_No_Bicep.docx
@@ -7,7 +7,7 @@
         <w:pStyle w:val="Title"/>
       </w:pPr>
       <w:r>
-        <w:t xml:space="preserve">Copilot Adoption Dashboard â€” Full Implementation Guide</w:t>
+        <w:t xml:space="preserve">Copilot Adoption Dashboard Ã¢â‚¬” Full Implementation Guide</w:t>
       </w:r>
     </w:p>
     <w:p>
@@ -540,7 +540,7 @@
         <w:rPr>
           <w:rStyle w:val="VerbatimChar"/>
         </w:rPr>
-        <w:t xml:space="preserve">        â”‚ every 15 min (PullCopilotAudit)</w:t>
+        <w:t xml:space="preserve">        Ã¢”â€š every 15 min (PullCopilotAudit)</w:t>
       </w:r>
       <w:r>
         <w:br/>
@@ -549,7 +549,7 @@
         <w:rPr>
           <w:rStyle w:val="VerbatimChar"/>
         </w:rPr>
-        <w:t xml:space="preserve">        â–¼</w:t>
+        <w:t xml:space="preserve">        Ã¢â€“Â¼</w:t>
       </w:r>
       <w:r>
         <w:br/>
@@ -567,7 +567,7 @@
         <w:rPr>
           <w:rStyle w:val="VerbatimChar"/>
         </w:rPr>
-        <w:t xml:space="preserve">   â”Œâ”€â”€â”€â”€â”´â”€â”€â”€â”€â”€â”€â”€â”€â”€â”€â”€â”€â”€â”€â”€â”€â”€â”€â”€â”€â”€â”€â”€â”€â”€â”€â”€â”€â”€â”€â”€â”€â”€â”€â”€â”€â”€â”€â”€â”€â”€â”€â”€â”</w:t>
+        <w:t xml:space="preserve">   Ã¢”Å’Ã¢”â‚¬Ã¢”â‚¬Ã¢”â‚¬Ã¢”â‚¬Ã¢”Â´Ã¢”â‚¬Ã¢”â‚¬Ã¢”â‚¬Ã¢”â‚¬Ã¢”â‚¬Ã¢”â‚¬Ã¢”â‚¬Ã¢”â‚¬Ã¢”â‚¬Ã¢”â‚¬Ã¢”â‚¬Ã¢”â‚¬Ã¢”â‚¬Ã¢”â‚¬Ã¢”â‚¬Ã¢”â‚¬Ã¢”â‚¬Ã¢”â‚¬Ã¢”â‚¬Ã¢”â‚¬Ã¢”â‚¬Ã¢”â‚¬Ã¢”â‚¬Ã¢”â‚¬Ã¢”â‚¬Ã¢”â‚¬Ã¢”â‚¬Ã¢”â‚¬Ã¢”â‚¬Ã¢”â‚¬Ã¢”â‚¬Ã¢”â‚¬Ã¢”â‚¬Ã¢”â‚¬Ã¢”â‚¬Ã¢”â‚¬Ã¢”â‚¬Ã¢”â‚¬Ã¢”â‚¬Ã¢”â‚¬Ã¢”â‚¬Ã¢”â‚¬Ã¢”â‚¬Ã¢”Â</w:t>
       </w:r>
       <w:r>
         <w:br/>
@@ -576,7 +576,7 @@
         <w:rPr>
           <w:rStyle w:val="VerbatimChar"/>
         </w:rPr>
-        <w:t xml:space="preserve">   â–¼                                                 â–¼</w:t>
+        <w:t xml:space="preserve">   Ã¢â€“Â¼                                                 Ã¢â€“Â¼</w:t>
       </w:r>
       <w:r>
         <w:br/>
@@ -594,7 +594,7 @@
         <w:rPr>
           <w:rStyle w:val="VerbatimChar"/>
         </w:rPr>
-        <w:t xml:space="preserve">   â”‚                                                 â”‚</w:t>
+        <w:t xml:space="preserve">   Ã¢”â€š                                                 Ã¢”â€š</w:t>
       </w:r>
       <w:r>
         <w:br/>
@@ -603,7 +603,7 @@
         <w:rPr>
           <w:rStyle w:val="VerbatimChar"/>
         </w:rPr>
-        <w:t xml:space="preserve">   â–¼                                                 â–¼</w:t>
+        <w:t xml:space="preserve">   Ã¢â€“Â¼                                                 Ã¢â€“Â¼</w:t>
       </w:r>
       <w:r>
         <w:br/>
@@ -621,7 +621,7 @@
         <w:rPr>
           <w:rStyle w:val="VerbatimChar"/>
         </w:rPr>
-        <w:t xml:space="preserve">   â”‚</w:t>
+        <w:t xml:space="preserve">   Ã¢”â€š</w:t>
       </w:r>
       <w:r>
         <w:br/>
@@ -630,7 +630,7 @@
         <w:rPr>
           <w:rStyle w:val="VerbatimChar"/>
         </w:rPr>
-        <w:t xml:space="preserve">   â–¼</w:t>
+        <w:t xml:space="preserve">   Ã¢â€“Â¼</w:t>
       </w:r>
       <w:r>
         <w:br/>
@@ -658,7 +658,7 @@
         <w:rPr>
           <w:rStyle w:val="VerbatimChar"/>
         </w:rPr>
-        <w:t xml:space="preserve">        â”‚ every 15 min (PullSharePointAgents)</w:t>
+        <w:t xml:space="preserve">        Ã¢”â€š every 15 min (PullSharePointAgents)</w:t>
       </w:r>
       <w:r>
         <w:br/>
@@ -667,7 +667,7 @@
         <w:rPr>
           <w:rStyle w:val="VerbatimChar"/>
         </w:rPr>
-        <w:t xml:space="preserve">        â–¼</w:t>
+        <w:t xml:space="preserve">        Ã¢â€“Â¼</w:t>
       </w:r>
       <w:r>
         <w:br/>
@@ -840,7 +840,7 @@
         </w:numPr>
       </w:pPr>
       <w:r>
-        <w:t xml:space="preserve">Portal â†’ Resource groups â†’ + Create</w:t>
+        <w:t xml:space="preserve">Portal Ã¢â€ ’ Resource groups Ã¢â€ ’ + Create</w:t>
       </w:r>
     </w:p>
     <w:p>
@@ -883,7 +883,7 @@
         </w:numPr>
       </w:pPr>
       <w:r>
-        <w:t xml:space="preserve">Portal â†’ Deploy a custom template â†’ Build your own template in the editor</w:t>
+        <w:t xml:space="preserve">Portal Ã¢â€ ’ Deploy a custom template Ã¢â€ ’ Build your own template in the editor</w:t>
       </w:r>
     </w:p>
     <w:p>
@@ -904,7 +904,7 @@
         <w:t xml:space="preserve">infra/azuredeploy.json</w:t>
       </w:r>
       <w:r>
-        <w:t xml:space="preserve"> â†’ Save</w:t>
+        <w:t xml:space="preserve"> Ã¢â€ ’ Save</w:t>
       </w:r>
     </w:p>
     <w:p>
@@ -1102,7 +1102,7 @@
               <w:pStyle w:val="Compact"/>
             </w:pPr>
             <w:r>
-              <w:t xml:space="preserve">e.g.Â </w:t>
+              <w:t xml:space="preserve">e.g.Ã‚Â </w:t>
             </w:r>
             <w:r>
               <w:rPr>
@@ -1162,7 +1162,7 @@
         </w:numPr>
       </w:pPr>
       <w:r>
-        <w:t xml:space="preserve">Review + create â†’ Create (~5-8 min)</w:t>
+        <w:t xml:space="preserve">Review + create Ã¢â€ ’ Create (~5-8 min)</w:t>
       </w:r>
     </w:p>
     <w:bookmarkEnd w:id="14"/>
@@ -1233,7 +1233,7 @@
         <w:pStyle w:val="FirstParagraph"/>
       </w:pPr>
       <w:r>
-        <w:t xml:space="preserve">Run locally â€” not in Cloud Shell.</w:t>
+        <w:t xml:space="preserve">Run locally Ã¢â‚¬” not in Cloud Shell.</w:t>
       </w:r>
     </w:p>
     <w:p>
@@ -1442,7 +1442,7 @@
         <w:pStyle w:val="FirstParagraph"/>
       </w:pPr>
       <w:r>
-        <w:t xml:space="preserve">A browser sign-in popup will appear â€” check your taskbar. The script grants:</w:t>
+        <w:t xml:space="preserve">A browser sign-in popup will appear Ã¢â‚¬” check your taskbar. The script grants:</w:t>
       </w:r>
     </w:p>
     <w:p>
@@ -1531,7 +1531,7 @@
         </w:numPr>
       </w:pPr>
       <w:r>
-        <w:t xml:space="preserve">Left navigation â†’ Audit</w:t>
+        <w:t xml:space="preserve">Left navigation Ã¢â€ ’ Audit</w:t>
       </w:r>
     </w:p>
     <w:p>
@@ -1568,7 +1568,7 @@
         <w:pStyle w:val="FirstParagraph"/>
       </w:pPr>
       <w:r>
-        <w:t xml:space="preserve">The Function App has private endpoints â€” use a brief public access window:</w:t>
+        <w:t xml:space="preserve">The Function App has private endpoints Ã¢â‚¬” use a brief public access window:</w:t>
       </w:r>
     </w:p>
     <w:p>
@@ -1911,7 +1911,7 @@
         <w:pStyle w:val="FirstParagraph"/>
       </w:pPr>
       <w:r>
-        <w:t xml:space="preserve">This deploys all four functions: - </w:t>
+        <w:t xml:space="preserve">This deploys all five functions: - </w:t>
       </w:r>
       <w:r>
         <w:rPr>
@@ -1921,7 +1921,7 @@
         <w:t xml:space="preserve">PullCopilotAudit</w:t>
       </w:r>
       <w:r>
-        <w:t xml:space="preserve"> â€” pulls Copilot audit events from Office 365 every 15 min - </w:t>
+        <w:t xml:space="preserve"> Ã¢â‚¬” pulls Copilot audit events from Office 365 every 15 min - </w:t>
       </w:r>
       <w:r>
         <w:rPr>
@@ -1931,7 +1931,7 @@
         <w:t xml:space="preserve">ExportAdoptionMetrics</w:t>
       </w:r>
       <w:r>
-        <w:t xml:space="preserve"> â€” aggregates ADLS data into SharePoint lists every 4 hours - </w:t>
+        <w:t xml:space="preserve"> Ã¢â‚¬” aggregates ADLS data into SharePoint lists every 4 hours - </w:t>
       </w:r>
       <w:r>
         <w:rPr>
@@ -1941,7 +1941,7 @@
         <w:t xml:space="preserve">PullSharePointAgents</w:t>
       </w:r>
       <w:r>
-        <w:t xml:space="preserve"> â€” tracks SharePoint agent file creation every 15 min - </w:t>
+        <w:t xml:space="preserve"> Ã¢â‚¬” tracks SharePoint agent file creation every 15 min - </w:t>
       </w:r>
       <w:r>
         <w:rPr>
@@ -1951,7 +1951,20 @@
         <w:t xml:space="preserve">StartSubscription</w:t>
       </w:r>
       <w:r>
-        <w:t xml:space="preserve"> â€” activates the audit subscription (one-time, idempotent)</w:t>
+        <w:t xml:space="preserve"> Ã¢â‚¬” activates the audit subscription (one-time, idempotent)</w:t>
+      </w:r>
+      <w:r>
+        <w:t xml:space="preserve"> - </w:t>
+      </w:r>
+      <w:r>
+        <w:rPr>
+          <w:b/>
+          <w:bCs/>
+        </w:rPr>
+        <w:t xml:space="preserve">PullCopilotStudioAgents</w:t>
+      </w:r>
+      <w:r>
+        <w:t xml:space="preserve"> â€” tracks Copilot Studio / M365 agent-builder agents from the Audit.General feed every 15 min</w:t>
       </w:r>
     </w:p>
     <w:p>
@@ -1980,7 +1993,7 @@
         </w:numPr>
       </w:pPr>
       <w:r>
-        <w:t xml:space="preserve">Portal â†’ Function App â†’ App files â†’ select </w:t>
+        <w:t xml:space="preserve">Portal Ã¢â€ ’ Function App Ã¢â€ ’ App files Ã¢â€ ’ select </w:t>
       </w:r>
       <w:r>
         <w:rPr>
@@ -2041,7 +2054,7 @@
         <w:pStyle w:val="FirstParagraph"/>
       </w:pPr>
       <w:r>
-        <w:t xml:space="preserve">Portal â†’ Functions â†’ StartSubscription â†’ Code + Test â†’ Test/Run â†’ Run</w:t>
+        <w:t xml:space="preserve">Portal Ã¢â€ ’ Functions Ã¢â€ ’ StartSubscription Ã¢â€ ’ Code + Test Ã¢â€ ’ Test/Run Ã¢â€ ’ Run</w:t>
       </w:r>
     </w:p>
     <w:p>
@@ -2098,7 +2111,7 @@
         <w:t xml:space="preserve">To create:</w:t>
       </w:r>
       <w:r>
-        <w:t xml:space="preserve"> Site home â†’ New â†’ List â†’ Blank list â†’ name it â†’ Create</w:t>
+        <w:t xml:space="preserve"> Site home Ã¢â€ ’ New Ã¢â€ ’ List Ã¢â€ ’ Blank list Ã¢â€ ’ name it Ã¢â€ ’ Create</w:t>
       </w:r>
     </w:p>
     <w:p>
@@ -2113,7 +2126,7 @@
         <w:t xml:space="preserve">To add a column:</w:t>
       </w:r>
       <w:r>
-        <w:t xml:space="preserve"> + Add column â†’ select type â†’ set name â†’ Save</w:t>
+        <w:t xml:space="preserve"> + Add column Ã¢â€ ’ select type Ã¢â€ ’ set name Ã¢â€ ’ Save</w:t>
       </w:r>
     </w:p>
     <w:p>
@@ -2128,7 +2141,7 @@
         <w:t xml:space="preserve">To hide Title column:</w:t>
       </w:r>
       <w:r>
-        <w:t xml:space="preserve"> column header â†’ Column settings â†’ Hide in view</w:t>
+        <w:t xml:space="preserve"> column header Ã¢â€ ’ Column settings Ã¢â€ ’ Hide in view</w:t>
       </w:r>
     </w:p>
     <w:p>
@@ -2203,7 +2216,7 @@
               <w:pStyle w:val="Compact"/>
             </w:pPr>
             <w:r>
-              <w:t xml:space="preserve">Single line of text (built-in â€” hide)</w:t>
+              <w:t xml:space="preserve">Single line of text (built-in Ã¢â‚¬” hide)</w:t>
             </w:r>
           </w:p>
         </w:tc>
@@ -2227,7 +2240,7 @@
               <w:pStyle w:val="Compact"/>
             </w:pPr>
             <w:r>
-              <w:t xml:space="preserve">Date and time â†’ Date only</w:t>
+              <w:t xml:space="preserve">Date and time Ã¢â€ ’ Date only</w:t>
             </w:r>
           </w:p>
         </w:tc>
@@ -2371,7 +2384,7 @@
               <w:pStyle w:val="Compact"/>
             </w:pPr>
             <w:r>
-              <w:t xml:space="preserve">Single line of text (built-in â€” hide)</w:t>
+              <w:t xml:space="preserve">Single line of text (built-in Ã¢â‚¬” hide)</w:t>
             </w:r>
           </w:p>
         </w:tc>
@@ -2395,7 +2408,7 @@
               <w:pStyle w:val="Compact"/>
             </w:pPr>
             <w:r>
-              <w:t xml:space="preserve">Date and time â†’ Date only</w:t>
+              <w:t xml:space="preserve">Date and time Ã¢â€ ’ Date only</w:t>
             </w:r>
           </w:p>
         </w:tc>
@@ -2539,7 +2552,7 @@
               <w:pStyle w:val="Compact"/>
             </w:pPr>
             <w:r>
-              <w:t xml:space="preserve">Single line of text (built-in â€” hide)</w:t>
+              <w:t xml:space="preserve">Single line of text (built-in Ã¢â‚¬” hide)</w:t>
             </w:r>
           </w:p>
         </w:tc>
@@ -2563,7 +2576,7 @@
               <w:pStyle w:val="Compact"/>
             </w:pPr>
             <w:r>
-              <w:t xml:space="preserve">Date and time â†’ Date only</w:t>
+              <w:t xml:space="preserve">Date and time Ã¢â€ ’ Date only</w:t>
             </w:r>
           </w:p>
         </w:tc>
@@ -2587,7 +2600,7 @@
               <w:pStyle w:val="Compact"/>
             </w:pPr>
             <w:r>
-              <w:t xml:space="preserve">Date and time â†’ Date only</w:t>
+              <w:t xml:space="preserve">Date and time Ã¢â€ ’ Date only</w:t>
             </w:r>
           </w:p>
         </w:tc>
@@ -2755,7 +2768,7 @@
               <w:pStyle w:val="Compact"/>
             </w:pPr>
             <w:r>
-              <w:t xml:space="preserve">Single line of text (built-in â€” hide)</w:t>
+              <w:t xml:space="preserve">Single line of text (built-in Ã¢â‚¬” hide)</w:t>
             </w:r>
           </w:p>
         </w:tc>
@@ -2779,7 +2792,7 @@
               <w:pStyle w:val="Compact"/>
             </w:pPr>
             <w:r>
-              <w:t xml:space="preserve">Date and time â†’ Date only</w:t>
+              <w:t xml:space="preserve">Date and time Ã¢â€ ’ Date only</w:t>
             </w:r>
           </w:p>
         </w:tc>
@@ -2940,7 +2953,7 @@
               <w:pStyle w:val="Compact"/>
             </w:pPr>
             <w:r>
-              <w:t xml:space="preserve">Single line of text (built-in â€” hide)</w:t>
+              <w:t xml:space="preserve">Single line of text (built-in Ã¢â‚¬” hide)</w:t>
             </w:r>
           </w:p>
         </w:tc>
@@ -3061,6 +3074,237 @@
             </w:pPr>
             <w:r>
               <w:t xml:space="preserve">Date and time</w:t>
+            </w:r>
+          </w:p>
+        </w:tc>
+      </w:tr>
+    </w:tbl>
+    <w:p>
+      <w:pPr>
+        <w:pStyle w:val="Heading2"/>
+      </w:pPr>
+      <w:r>
+        <w:t xml:space="preserve">List 6: CopilotStudioAgentRegistry</w:t>
+      </w:r>
+    </w:p>
+    <w:p>
+      <w:pPr>
+        <w:pStyle w:val="FirstParagraph"/>
+      </w:pPr>
+      <w:r>
+        <w:t xml:space="preserve">A permanent, append-only registry of Copilot Studio and M365 agent-builder agents detected in the Audit.General feed. Populated automatically by </w:t>
+      </w:r>
+      <w:r>
+        <w:rPr>
+          <w:rStyle w:val="VerbatimChar"/>
+        </w:rPr>
+        <w:t xml:space="preserve">PullCopilotStudioAgents</w:t>
+      </w:r>
+      <w:r>
+        <w:t xml:space="preserve">. Keyed on the agent bot GUID (audit events do not carry the display name).</w:t>
+      </w:r>
+    </w:p>
+    <w:tbl>
+      <w:tblPr>
+        <w:tblStyle w:val="Table"/>
+        <w:tblW w:type="auto" w:w="0"/>
+        <w:tblLook w:firstRow="1" w:lastRow="0" w:firstColumn="0" w:lastColumn="0" w:noHBand="0" w:noVBand="0" w:val="0020"/>
+      </w:tblPr>
+      <w:tblGrid>
+        <w:gridCol w:w="3960"/>
+        <w:gridCol w:w="3960"/>
+      </w:tblGrid>
+      <w:tr>
+        <w:trPr>
+          <w:tblHeader w:val="on"/>
+        </w:trPr>
+        <w:tc>
+          <w:tcPr/>
+          <w:p>
+            <w:pPr>
+              <w:pStyle w:val="Compact"/>
+            </w:pPr>
+            <w:r>
+              <w:t xml:space="preserve">Column</w:t>
+            </w:r>
+          </w:p>
+        </w:tc>
+        <w:tc>
+          <w:tcPr/>
+          <w:p>
+            <w:pPr>
+              <w:pStyle w:val="Compact"/>
+            </w:pPr>
+            <w:r>
+              <w:t xml:space="preserve">Type</w:t>
+            </w:r>
+          </w:p>
+        </w:tc>
+      </w:tr>
+      <w:tr>
+        <w:tc>
+          <w:tcPr/>
+          <w:p>
+            <w:pPr>
+              <w:pStyle w:val="Compact"/>
+            </w:pPr>
+            <w:r>
+              <w:t xml:space="preserve">Title</w:t>
+            </w:r>
+          </w:p>
+        </w:tc>
+        <w:tc>
+          <w:tcPr/>
+          <w:p>
+            <w:pPr>
+              <w:pStyle w:val="Compact"/>
+            </w:pPr>
+            <w:r>
+              <w:t xml:space="preserve">Single line of text (built-in â€” hide; set to AgentId)</w:t>
+            </w:r>
+          </w:p>
+        </w:tc>
+      </w:tr>
+      <w:tr>
+        <w:tc>
+          <w:tcPr/>
+          <w:p>
+            <w:pPr>
+              <w:pStyle w:val="Compact"/>
+            </w:pPr>
+            <w:r>
+              <w:t xml:space="preserve">AgentId</w:t>
+            </w:r>
+          </w:p>
+        </w:tc>
+        <w:tc>
+          <w:tcPr/>
+          <w:p>
+            <w:pPr>
+              <w:pStyle w:val="Compact"/>
+            </w:pPr>
+            <w:r>
+              <w:t xml:space="preserve">Single line of text</w:t>
+            </w:r>
+          </w:p>
+        </w:tc>
+      </w:tr>
+      <w:tr>
+        <w:tc>
+          <w:tcPr/>
+          <w:p>
+            <w:pPr>
+              <w:pStyle w:val="Compact"/>
+            </w:pPr>
+            <w:r>
+              <w:t xml:space="preserve">EnvironmentId</w:t>
+            </w:r>
+          </w:p>
+        </w:tc>
+        <w:tc>
+          <w:tcPr/>
+          <w:p>
+            <w:pPr>
+              <w:pStyle w:val="Compact"/>
+            </w:pPr>
+            <w:r>
+              <w:t xml:space="preserve">Single line of text</w:t>
+            </w:r>
+          </w:p>
+        </w:tc>
+      </w:tr>
+      <w:tr>
+        <w:tc>
+          <w:tcPr/>
+          <w:p>
+            <w:pPr>
+              <w:pStyle w:val="Compact"/>
+            </w:pPr>
+            <w:r>
+              <w:t xml:space="preserve">EventType</w:t>
+            </w:r>
+          </w:p>
+        </w:tc>
+        <w:tc>
+          <w:tcPr/>
+          <w:p>
+            <w:pPr>
+              <w:pStyle w:val="Compact"/>
+            </w:pPr>
+            <w:r>
+              <w:t xml:space="preserve">Single line of text (Authoring or Published)</w:t>
+            </w:r>
+          </w:p>
+        </w:tc>
+      </w:tr>
+      <w:tr>
+        <w:tc>
+          <w:tcPr/>
+          <w:p>
+            <w:pPr>
+              <w:pStyle w:val="Compact"/>
+            </w:pPr>
+            <w:r>
+              <w:t xml:space="preserve">CreatedBy</w:t>
+            </w:r>
+          </w:p>
+        </w:tc>
+        <w:tc>
+          <w:tcPr/>
+          <w:p>
+            <w:pPr>
+              <w:pStyle w:val="Compact"/>
+            </w:pPr>
+            <w:r>
+              <w:t xml:space="preserve">Single line of text</w:t>
+            </w:r>
+          </w:p>
+        </w:tc>
+      </w:tr>
+      <w:tr>
+        <w:tc>
+          <w:tcPr/>
+          <w:p>
+            <w:pPr>
+              <w:pStyle w:val="Compact"/>
+            </w:pPr>
+            <w:r>
+              <w:t xml:space="preserve">EventDate</w:t>
+            </w:r>
+          </w:p>
+        </w:tc>
+        <w:tc>
+          <w:tcPr/>
+          <w:p>
+            <w:pPr>
+              <w:pStyle w:val="Compact"/>
+            </w:pPr>
+            <w:r>
+              <w:t xml:space="preserve">Date and time</w:t>
+            </w:r>
+          </w:p>
+        </w:tc>
+      </w:tr>
+      <w:tr>
+        <w:tc>
+          <w:tcPr/>
+          <w:p>
+            <w:pPr>
+              <w:pStyle w:val="Compact"/>
+            </w:pPr>
+            <w:r>
+              <w:t xml:space="preserve">ApiPath</w:t>
+            </w:r>
+          </w:p>
+        </w:tc>
+        <w:tc>
+          <w:tcPr/>
+          <w:p>
+            <w:pPr>
+              <w:pStyle w:val="Compact"/>
+            </w:pPr>
+            <w:r>
+              <w:t xml:space="preserve">Single line of text</w:t>
             </w:r>
           </w:p>
         </w:tc>
@@ -3089,7 +3333,7 @@
         <w:pStyle w:val="FirstParagraph"/>
       </w:pPr>
       <w:r>
-        <w:t xml:space="preserve">Portal â†’ Function App â†’ Settings â†’ Environment variables â†’ + Add each â†’ Apply â†’ Confirm</w:t>
+        <w:t xml:space="preserve">Portal Ã¢â€ ’ Function App Ã¢â€ ’ Settings Ã¢â€ ’ Environment variables Ã¢â€ ’ + Add each Ã¢â€ ’ Apply Ã¢â€ ’ Confirm</w:t>
       </w:r>
     </w:p>
     <w:tbl>
@@ -3399,6 +3643,88 @@
               <w:rPr>
                 <w:rStyle w:val="VerbatimChar"/>
               </w:rPr>
+              <w:t xml:space="preserve">SHAREPOINT_AGENT_STUDIO_LIST</w:t>
+            </w:r>
+          </w:p>
+        </w:tc>
+        <w:tc>
+          <w:tcPr/>
+          <w:p>
+            <w:pPr>
+              <w:pStyle w:val="Compact"/>
+            </w:pPr>
+            <w:r>
+              <w:rPr>
+                <w:rStyle w:val="VerbatimChar"/>
+              </w:rPr>
+              <w:t xml:space="preserve">CopilotStudioAgentRegistry</w:t>
+            </w:r>
+          </w:p>
+        </w:tc>
+        <w:tc>
+          <w:tcPr/>
+          <w:p>
+            <w:pPr>
+              <w:pStyle w:val="Compact"/>
+            </w:pPr>
+            <w:r>
+              <w:t xml:space="preserve">Both modes</w:t>
+            </w:r>
+          </w:p>
+        </w:tc>
+      </w:tr>
+      <w:tr>
+        <w:tc>
+          <w:tcPr/>
+          <w:p>
+            <w:pPr>
+              <w:pStyle w:val="Compact"/>
+            </w:pPr>
+            <w:r>
+              <w:rPr>
+                <w:rStyle w:val="VerbatimChar"/>
+              </w:rPr>
+              <w:t xml:space="preserve">AGENT_STUDIO_WINDOW_MINUTES</w:t>
+            </w:r>
+          </w:p>
+        </w:tc>
+        <w:tc>
+          <w:tcPr/>
+          <w:p>
+            <w:pPr>
+              <w:pStyle w:val="Compact"/>
+            </w:pPr>
+            <w:r>
+              <w:rPr>
+                <w:rStyle w:val="VerbatimChar"/>
+              </w:rPr>
+              <w:t xml:space="preserve">16</w:t>
+            </w:r>
+          </w:p>
+        </w:tc>
+        <w:tc>
+          <w:tcPr/>
+          <w:p>
+            <w:pPr>
+              <w:pStyle w:val="Compact"/>
+            </w:pPr>
+            <w:r>
+              <w:t xml:space="preserve">Both modes</w:t>
+            </w:r>
+          </w:p>
+        </w:tc>
+      </w:tr>
+      <w:tr>
+        <w:tc>
+          <w:tcPr/>
+          <w:p>
+            <w:pPr>
+              <w:pStyle w:val="Compact"/>
+            </w:pPr>
+            <w:r>
+              <w:rPr>
+                <w:rStyle w:val="VerbatimChar"/>
+              </w:rPr>
               <w:t xml:space="preserve">METRICS_LOOKBACK_DAYS</w:t>
             </w:r>
           </w:p>
@@ -3564,7 +3890,7 @@
         <w:pStyle w:val="FirstParagraph"/>
       </w:pPr>
       <w:r>
-        <w:t xml:space="preserve">Portal â†’ Functions â†’ ExportAdoptionMetrics â†’ Code + Test â†’ Test/Run â†’ Run</w:t>
+        <w:t xml:space="preserve">Portal Ã¢â€ ’ Functions Ã¢â€ ’ ExportAdoptionMetrics Ã¢â€ ’ Code + Test Ã¢â€ ’ Test/Run Ã¢â€ ’ Run</w:t>
       </w:r>
     </w:p>
     <w:p>
@@ -3608,7 +3934,7 @@
         <w:pStyle w:val="FirstParagraph"/>
       </w:pPr>
       <w:r>
-        <w:t xml:space="preserve">Portal â†’ Functions â†’ PullSharePointAgents â†’ Code + Test â†’ Test/Run â†’ Run</w:t>
+        <w:t xml:space="preserve">Portal Ã¢â€ ’ Functions Ã¢â€ ’ PullSharePointAgents Ã¢â€ ’ Code + Test Ã¢â€ ’ Test/Run Ã¢â€ ’ Run</w:t>
       </w:r>
     </w:p>
     <w:p>
@@ -3657,7 +3983,7 @@
         <w:t xml:space="preserve">TIME_WINDOW_MINUTES</w:t>
       </w:r>
       <w:r>
-        <w:t xml:space="preserve"> (e.g.Â </w:t>
+        <w:t xml:space="preserve"> (e.g.Ã‚Â </w:t>
       </w:r>
       <w:r>
         <w:rPr>
@@ -3693,7 +4019,7 @@
         <w:t xml:space="preserve">append-only</w:t>
       </w:r>
       <w:r>
-        <w:t xml:space="preserve"> â€” it never deletes or overwrites entries. Running it multiple times is safe due to deduplication by </w:t>
+        <w:t xml:space="preserve"> Ã¢â‚¬” it never deletes or overwrites entries. Running it multiple times is safe due to deduplication by </w:t>
       </w:r>
       <w:r>
         <w:rPr>
@@ -3764,7 +4090,7 @@
         </w:numPr>
       </w:pPr>
       <w:r>
-        <w:t xml:space="preserve">https://make.powerapps.com â†’ + Create â†’ Start with data â†’ SharePoint</w:t>
+        <w:t xml:space="preserve">https://make.powerapps.com Ã¢â€ ’ + Create Ã¢â€ ’ Start with data Ã¢â€ ’ SharePoint</w:t>
       </w:r>
     </w:p>
     <w:p>
@@ -3776,7 +4102,7 @@
         </w:numPr>
       </w:pPr>
       <w:r>
-        <w:t xml:space="preserve">Connect to your site â†’ pick </w:t>
+        <w:t xml:space="preserve">Connect to your site Ã¢â€ ’ pick </w:t>
       </w:r>
       <w:r>
         <w:rPr>
@@ -3806,7 +4132,7 @@
         </w:numPr>
       </w:pPr>
       <w:r>
-        <w:t xml:space="preserve">Build screens, File â†’ Save â†’ Publish</w:t>
+        <w:t xml:space="preserve">Build screens, File Ã¢â€ ’ Save Ã¢â€ ’ Publish</w:t>
       </w:r>
     </w:p>
     <w:p>
@@ -3864,7 +4190,7 @@
         </w:numPr>
       </w:pPr>
       <w:r>
-        <w:t xml:space="preserve">Portal â†’ Azure Monitor â†’ Workbooks â†’ + New â†’ Edit</w:t>
+        <w:t xml:space="preserve">Portal Ã¢â€ ’ Azure Monitor Ã¢â€ ’ Workbooks Ã¢â€ ’ + New Ã¢â€ ’ Edit</w:t>
       </w:r>
     </w:p>
     <w:p>
@@ -3876,7 +4202,7 @@
         </w:numPr>
       </w:pPr>
       <w:r>
-        <w:t xml:space="preserve">Advanced Editor â†’ paste </w:t>
+        <w:t xml:space="preserve">Advanced Editor Ã¢â€ ’ paste </w:t>
       </w:r>
       <w:r>
         <w:rPr>
@@ -3894,7 +4220,7 @@
         </w:numPr>
       </w:pPr>
       <w:r>
-        <w:t>Apply â†’ Save as “Copilot Adoption Dashboard”</w:t>
+        <w:t>Apply Ã¢â€ ’ Save as “Copilot Adoption Dashboard”</w:t>
       </w:r>
     </w:p>
     <w:p>
@@ -3911,7 +4237,7 @@
         <w:pStyle w:val="Heading1"/>
       </w:pPr>
       <w:r>
-        <w:t xml:space="preserve">Agent Tracking â€” How It Works</w:t>
+        <w:t xml:space="preserve">Agent Tracking Ã¢â‚¬” How It Works</w:t>
       </w:r>
     </w:p>
     <w:p>
@@ -3988,7 +4314,7 @@
         <w:t xml:space="preserve">AgentName</w:t>
       </w:r>
       <w:r>
-        <w:t xml:space="preserve"> â€” derived from the filename (e.g.Â </w:t>
+        <w:t xml:space="preserve"> Ã¢â‚¬” derived from the filename (e.g.Ã‚Â </w:t>
       </w:r>
       <w:r>
         <w:rPr>
@@ -4007,7 +4333,7 @@
         <w:t xml:space="preserve">SiteUrl</w:t>
       </w:r>
       <w:r>
-        <w:t xml:space="preserve"> â€” the SharePoint site where the agent was created - </w:t>
+        <w:t xml:space="preserve"> Ã¢â‚¬” the SharePoint site where the agent was created - </w:t>
       </w:r>
       <w:r>
         <w:rPr>
@@ -4017,7 +4343,7 @@
         <w:t xml:space="preserve">AgentFileUrl</w:t>
       </w:r>
       <w:r>
-        <w:t xml:space="preserve"> â€” full path to the </w:t>
+        <w:t xml:space="preserve"> Ã¢â‚¬” full path to the </w:t>
       </w:r>
       <w:r>
         <w:rPr>
@@ -4036,7 +4362,7 @@
         <w:t xml:space="preserve">CreatedBy</w:t>
       </w:r>
       <w:r>
-        <w:t xml:space="preserve"> â€” UPN of the user who created it - </w:t>
+        <w:t xml:space="preserve"> Ã¢â‚¬” UPN of the user who created it - </w:t>
       </w:r>
       <w:r>
         <w:rPr>
@@ -4046,7 +4372,7 @@
         <w:t xml:space="preserve">CreatedDate</w:t>
       </w:r>
       <w:r>
-        <w:t xml:space="preserve"> â€” timestamp of creation</w:t>
+        <w:t xml:space="preserve"> Ã¢â‚¬” timestamp of creation</w:t>
       </w:r>
     </w:p>
     <w:p>
@@ -4142,7 +4468,7 @@
         <w:t xml:space="preserve">Contexts</w:t>
       </w:r>
       <w:r>
-        <w:t xml:space="preserve"> field in SharePoint Copilot interaction events is empty in the current audit schema â€” the page URL where the agent is deployed is not logged in interaction events. The agent’s site is only available at creation time via </w:t>
+        <w:t xml:space="preserve"> field in SharePoint Copilot interaction events is empty in the current audit schema Ã¢â‚¬” the page URL where the agent is deployed is not logged in interaction events. The agent’s site is only available at creation time via </w:t>
       </w:r>
       <w:r>
         <w:rPr>
@@ -4185,7 +4511,7 @@
         <w:pStyle w:val="FirstParagraph"/>
       </w:pPr>
       <w:r>
-        <w:t xml:space="preserve">The saved state timestamp exceeds 24 hours. The code auto-caps at 23 h â€” self-heals on next run. To force a reset, delete </w:t>
+        <w:t xml:space="preserve">The saved state timestamp exceeds 24 hours. The code auto-caps at 23 h Ã¢â‚¬” self-heals on next run. To force a reset, delete </w:t>
       </w:r>
       <w:r>
         <w:rPr>
@@ -4339,7 +4665,7 @@
         </w:numPr>
       </w:pPr>
       <w:r>
-        <w:t>Check logs for “Found 0 Audit.SharePoint blob(s)” â€” this means the subscription may not have been active at creation time; future creations will be captured automatically</w:t>
+        <w:t>Check logs for “Found 0 Audit.SharePoint blob(s)” Ã¢â‚¬” this means the subscription may not have been active at creation time; future creations will be captured automatically</w:t>
       </w:r>
     </w:p>
     <w:bookmarkEnd w:id="38"/>
@@ -4366,7 +4692,7 @@
         <w:t xml:space="preserve">ExportAdoptionMetrics</w:t>
       </w:r>
       <w:r>
-        <w:t xml:space="preserve"> run. If you see duplicates, manually delete all items from the affected lists and run once â€” the function will produce a clean single copy.</w:t>
+        <w:t xml:space="preserve"> run. If you see duplicates, manually delete all items from the affected lists and run once Ã¢â‚¬” the function will produce a clean single copy.</w:t>
       </w:r>
     </w:p>
     <w:p>

</xml_diff>